<commit_message>
Contratos: plantillas nuevas y monto con letra
Reemplaza las 8 plantillas de contrato por las nuevas (Coworking 30 hrs,
con y sin depósito, y Oficina, física y moral) con los marcadores repuestos
sobre los datos de ejemplo. Las plantillas piden el importe con letra, así que
se agregan {{PRECIO_MENSUAL_LETRA}} y {{DEPOSITO_GARANTIA_LETRA}} (lib/importeLetra.ts)
y los importes del contrato salen sin "MXN" duplicado.

De paso se llenan datos que las plantillas anteriores dejaban sin marcador y
salían como texto de ejemplo en el contrato: renta de Oficina ("$0.00 (Monto con
letra…)"), depósito del anexo de Oficina, el espacio de Coworking en una cláusula
y el nombre en el bloque de firma de Coworking 30 hrs persona física.

Co-Authored-By: Claude Sonnet 5.5 <noreply@anthropic.com>
</commit_message>
<xml_diff>
--- a/public/plantillas-contrato/BosquesCoworking30hrsFisica.docx
+++ b/public/plantillas-contrato/BosquesCoworking30hrsFisica.docx
@@ -1683,7 +1683,7 @@
           <w:highlight w:val="yellow"/>
           <w:rtl w:val="0"/>
         </w:rPr>
-        <w:t xml:space="preserve">{{PRECIO_MENSUAL}}</w:t>
+        <w:t xml:space="preserve">{{PRECIO_MENSUAL}} ({{PRECIO_MENSUAL_LETRA}})</w:t>
       </w:r>
       <w:r>
         <w:rPr>
@@ -3517,7 +3517,7 @@
                 <w:highlight w:val="yellow"/>
                 <w:rtl w:val="0"/>
               </w:rPr>
-              <w:t xml:space="preserve">NOMBRE DE LA EMPRESA</w:t>
+              <w:t xml:space="preserve">{{NOMBRE_CLIENTE}}</w:t>
             </w:r>
             <w:r>
               <w:rPr>

</xml_diff>